<commit_message>
Finalize report verification, decision assumptions and stage navigation
</commit_message>
<xml_diff>
--- a/reports/phase2/phase2_threshold_transfer_report.docx
+++ b/reports/phase2/phase2_threshold_transfer_report.docx
@@ -1224,6 +1224,362 @@
       </w:pPr>
       <w:r>
         <w:t>Primary loss is L100 = 100(r FN + FP)/N. Counts, recall, precision, alert rate and excess max(0, Alerts − floor(B N)) accompany it. Costs are hypothetical relative weights, not monetary estimates. Pooled slots and excess sum phase-specific quantities without offsetting excess in one phase against spare capacity in another.</w:t>
+      </w:r>
+    </w:p>
+    <w:p>
+      <w:pPr>
+        <w:pStyle w:val="Heading1"/>
+        <w:pageBreakBefore/>
+      </w:pPr>
+      <w:r>
+        <w:t>2.1 Decision assumptions and evaluation scope</w:t>
+      </w:r>
+    </w:p>
+    <w:p>
+      <w:pPr>
+        <w:pStyle w:val="Caption"/>
+      </w:pPr>
+      <w:r>
+        <w:t>Table 2a. Decision assumptions and evaluation scope</w:t>
+      </w:r>
+    </w:p>
+    <w:tbl>
+      <w:tblPr>
+        <w:tblW w:type="auto" w:w="0"/>
+        <w:tblLayout w:type="fixed"/>
+        <w:tblLook w:firstColumn="1" w:firstRow="1" w:lastColumn="0" w:lastRow="0" w:noHBand="0" w:noVBand="1" w:val="04A0"/>
+        <w:tblBorders>
+          <w:top w:val="single" w:sz="4" w:color="AAAAAA"/>
+          <w:bottom w:val="single" w:sz="4" w:color="AAAAAA"/>
+          <w:insideH w:val="single" w:sz="4" w:color="AAAAAA"/>
+        </w:tblBorders>
+      </w:tblPr>
+      <w:tblGrid>
+        <w:gridCol w:w="2088"/>
+        <w:gridCol w:w="7171"/>
+      </w:tblGrid>
+      <w:tr>
+        <w:trPr>
+          <w:tblHeader/>
+          <w:cantSplit/>
+        </w:trPr>
+        <w:tc>
+          <w:tcPr>
+            <w:tcW w:type="dxa" w:w="2088"/>
+            <w:shd w:fill="EEEEEE"/>
+          </w:tcPr>
+          <w:p>
+            <w:pPr>
+              <w:spacing w:after="60" w:before="60" w:line="240" w:lineRule="auto"/>
+            </w:pPr>
+            <w:r>
+              <w:rPr>
+                <w:b/>
+                <w:sz w:val="18"/>
+              </w:rPr>
+              <w:t>Item</w:t>
+            </w:r>
+          </w:p>
+        </w:tc>
+        <w:tc>
+          <w:tcPr>
+            <w:tcW w:type="dxa" w:w="7171"/>
+            <w:shd w:fill="EEEEEE"/>
+          </w:tcPr>
+          <w:p>
+            <w:pPr>
+              <w:spacing w:after="60" w:before="60" w:line="240" w:lineRule="auto"/>
+            </w:pPr>
+            <w:r>
+              <w:rPr>
+                <w:b/>
+                <w:sz w:val="18"/>
+              </w:rPr>
+              <w:t>Definition and evaluation scope</w:t>
+            </w:r>
+          </w:p>
+        </w:tc>
+      </w:tr>
+      <w:tr>
+        <w:trPr>
+          <w:cantSplit/>
+        </w:trPr>
+        <w:tc>
+          <w:tcPr>
+            <w:tcW w:type="dxa" w:w="2088"/>
+          </w:tcPr>
+          <w:p>
+            <w:pPr>
+              <w:spacing w:after="60" w:before="60" w:line="240" w:lineRule="auto"/>
+            </w:pPr>
+            <w:r>
+              <w:rPr>
+                <w:b w:val="0"/>
+                <w:sz w:val="18"/>
+              </w:rPr>
+              <w:t>Alert object</w:t>
+            </w:r>
+          </w:p>
+        </w:tc>
+        <w:tc>
+          <w:tcPr>
+            <w:tcW w:type="dxa" w:w="7171"/>
+          </w:tcPr>
+          <w:p>
+            <w:pPr>
+              <w:spacing w:after="60" w:before="60" w:line="240" w:lineRule="auto"/>
+            </w:pPr>
+            <w:r>
+              <w:rPr>
+                <w:b w:val="0"/>
+                <w:sz w:val="18"/>
+              </w:rPr>
+              <w:t>One dataset shift record flagged as hazardous for the next shift; recorded row order is a temporal proxy.</w:t>
+            </w:r>
+          </w:p>
+        </w:tc>
+      </w:tr>
+      <w:tr>
+        <w:trPr>
+          <w:cantSplit/>
+        </w:trPr>
+        <w:tc>
+          <w:tcPr>
+            <w:tcW w:type="dxa" w:w="2088"/>
+          </w:tcPr>
+          <w:p>
+            <w:pPr>
+              <w:spacing w:after="60" w:before="60" w:line="240" w:lineRule="auto"/>
+            </w:pPr>
+            <w:r>
+              <w:rPr>
+                <w:b w:val="0"/>
+                <w:sz w:val="18"/>
+              </w:rPr>
+              <w:t>Capacity unit</w:t>
+            </w:r>
+          </w:p>
+        </w:tc>
+        <w:tc>
+          <w:tcPr>
+            <w:tcW w:type="dxa" w:w="7171"/>
+          </w:tcPr>
+          <w:p>
+            <w:pPr>
+              <w:spacing w:after="60" w:before="60" w:line="240" w:lineRule="auto"/>
+            </w:pPr>
+            <w:r>
+              <w:rPr>
+                <w:b w:val="0"/>
+                <w:sz w:val="18"/>
+              </w:rPr>
+              <w:t>One flagged record represents one assumed inspection slot. Historical slots are floor(B Nref); later slots are floor(B Ntest), separately for each block. Inspection duration and staffing are not measured.</w:t>
+            </w:r>
+          </w:p>
+        </w:tc>
+      </w:tr>
+      <w:tr>
+        <w:trPr>
+          <w:cantSplit/>
+        </w:trPr>
+        <w:tc>
+          <w:tcPr>
+            <w:tcW w:type="dxa" w:w="2088"/>
+          </w:tcPr>
+          <w:p>
+            <w:pPr>
+              <w:spacing w:after="60" w:before="60" w:line="240" w:lineRule="auto"/>
+            </w:pPr>
+            <w:r>
+              <w:rPr>
+                <w:b w:val="0"/>
+                <w:sz w:val="18"/>
+              </w:rPr>
+              <w:t>TP / FP / FN</w:t>
+            </w:r>
+          </w:p>
+        </w:tc>
+        <w:tc>
+          <w:tcPr>
+            <w:tcW w:type="dxa" w:w="7171"/>
+          </w:tcPr>
+          <w:p>
+            <w:pPr>
+              <w:spacing w:after="60" w:before="60" w:line="240" w:lineRule="auto"/>
+            </w:pPr>
+            <w:r>
+              <w:rPr>
+                <w:b w:val="0"/>
+                <w:sz w:val="18"/>
+              </w:rPr>
+              <w:t>TP: flagged hazardous shift. FP: flagged non-hazardous shift. FN: unflagged hazardous shift. TP counts label coverage, not confirmed inspections or avoided accidents.</w:t>
+            </w:r>
+          </w:p>
+        </w:tc>
+      </w:tr>
+      <w:tr>
+        <w:trPr>
+          <w:cantSplit/>
+        </w:trPr>
+        <w:tc>
+          <w:tcPr>
+            <w:tcW w:type="dxa" w:w="2088"/>
+          </w:tcPr>
+          <w:p>
+            <w:pPr>
+              <w:spacing w:after="60" w:before="60" w:line="240" w:lineRule="auto"/>
+            </w:pPr>
+            <w:r>
+              <w:rPr>
+                <w:b w:val="0"/>
+                <w:sz w:val="18"/>
+              </w:rPr>
+              <w:t>Relative loss</w:t>
+            </w:r>
+          </w:p>
+        </w:tc>
+        <w:tc>
+          <w:tcPr>
+            <w:tcW w:type="dxa" w:w="7171"/>
+          </w:tcPr>
+          <w:p>
+            <w:pPr>
+              <w:spacing w:after="60" w:before="60" w:line="240" w:lineRule="auto"/>
+            </w:pPr>
+            <w:r>
+              <w:rPr>
+                <w:b w:val="0"/>
+                <w:sz w:val="18"/>
+              </w:rPr>
+              <w:t>L = r FN + FP assigns missed hazardous shifts cost r and false alerts cost 1. It includes no separate TP inspection cost, accident-severity cost, delay cost or monetary estimate.</w:t>
+            </w:r>
+          </w:p>
+        </w:tc>
+      </w:tr>
+      <w:tr>
+        <w:trPr>
+          <w:cantSplit/>
+        </w:trPr>
+        <w:tc>
+          <w:tcPr>
+            <w:tcW w:type="dxa" w:w="2088"/>
+          </w:tcPr>
+          <w:p>
+            <w:pPr>
+              <w:spacing w:after="60" w:before="60" w:line="240" w:lineRule="auto"/>
+            </w:pPr>
+            <w:r>
+              <w:rPr>
+                <w:b w:val="0"/>
+                <w:sz w:val="18"/>
+              </w:rPr>
+              <w:t>Excess alerts</w:t>
+            </w:r>
+          </w:p>
+        </w:tc>
+        <w:tc>
+          <w:tcPr>
+            <w:tcW w:type="dxa" w:w="7171"/>
+          </w:tcPr>
+          <w:p>
+            <w:pPr>
+              <w:spacing w:after="60" w:before="60" w:line="240" w:lineRule="auto"/>
+            </w:pPr>
+            <w:r>
+              <w:rPr>
+                <w:b w:val="0"/>
+                <w:sz w:val="18"/>
+              </w:rPr>
+              <w:t>Excess = max(0, Alerts − floor(B Ntest)). All score-based alerts remain in TP/FP/FN and loss. Excess is recorded as demand; alerts are not truncated, queued or assigned an additional loss penalty.</w:t>
+            </w:r>
+          </w:p>
+        </w:tc>
+      </w:tr>
+      <w:tr>
+        <w:trPr>
+          <w:cantSplit/>
+        </w:trPr>
+        <w:tc>
+          <w:tcPr>
+            <w:tcW w:type="dxa" w:w="2088"/>
+          </w:tcPr>
+          <w:p>
+            <w:pPr>
+              <w:spacing w:after="60" w:before="60" w:line="240" w:lineRule="auto"/>
+            </w:pPr>
+            <w:r>
+              <w:rPr>
+                <w:b w:val="0"/>
+                <w:sz w:val="18"/>
+              </w:rPr>
+              <w:t>Pooled accounting</w:t>
+            </w:r>
+          </w:p>
+        </w:tc>
+        <w:tc>
+          <w:tcPr>
+            <w:tcW w:type="dxa" w:w="7171"/>
+          </w:tcPr>
+          <w:p>
+            <w:pPr>
+              <w:spacing w:after="60" w:before="60" w:line="240" w:lineRule="auto"/>
+            </w:pPr>
+            <w:r>
+              <w:rPr>
+                <w:b w:val="0"/>
+                <w:sz w:val="18"/>
+              </w:rPr>
+              <w:t>Sum counts, slots and excess over the four later blocks; divide total loss by total records to obtain loss per 100. Spare slots in one block do not offset excess in another.</w:t>
+            </w:r>
+          </w:p>
+        </w:tc>
+      </w:tr>
+      <w:tr>
+        <w:trPr>
+          <w:cantSplit/>
+        </w:trPr>
+        <w:tc>
+          <w:tcPr>
+            <w:tcW w:type="dxa" w:w="2088"/>
+          </w:tcPr>
+          <w:p>
+            <w:pPr>
+              <w:spacing w:after="60" w:before="60" w:line="240" w:lineRule="auto"/>
+            </w:pPr>
+            <w:r>
+              <w:rPr>
+                <w:b w:val="0"/>
+                <w:sz w:val="18"/>
+              </w:rPr>
+              <w:t>Operational evidence</w:t>
+            </w:r>
+          </w:p>
+        </w:tc>
+        <w:tc>
+          <w:tcPr>
+            <w:tcW w:type="dxa" w:w="7171"/>
+          </w:tcPr>
+          <w:p>
+            <w:pPr>
+              <w:spacing w:after="60" w:before="60" w:line="240" w:lineRule="auto"/>
+            </w:pPr>
+            <w:r>
+              <w:rPr>
+                <w:b w:val="0"/>
+                <w:sz w:val="18"/>
+              </w:rPr>
+              <w:t>Actual inspection execution and accident prevention are not observed. Capacity and relative costs are explicit hypothetical decision settings.</w:t>
+            </w:r>
+          </w:p>
+        </w:tc>
+      </w:tr>
+    </w:tbl>
+    <w:p>
+      <w:pPr>
+        <w:jc w:val="both"/>
+      </w:pPr>
+      <w:r>
+        <w:t>These assumptions define how frozen warning rules create inspection demand. The evaluation connects hazardous-shift coverage to relative loss and workload; excess demand remains in the alert counts. Detections count hazardous shifts flagged, while dispatch, queueing and safety interventions are outside the evaluated process.</w:t>
       </w:r>
     </w:p>
     <w:p>
@@ -6720,7 +7076,7 @@
         <w:pStyle w:val="Caption"/>
       </w:pPr>
       <w:r>
-        <w:t>Figure 3. C policy changes after fitting on all outer history, with parameters and numerical thresholds held fixed. Negative loss differences favor refitting; negative alert differences mean fewer inspections. Alert-count changes in the second panel are labelled as integers.</w:t>
+        <w:t>Figure 3. C policy changes after fitting on all outer history, with parameters and numerical thresholds held fixed. Negative loss differences favor refitting; negative alert differences mean lower inspection demand. Alert-count changes in the second panel are labelled as integers.</w:t>
       </w:r>
     </w:p>
     <w:p>

</xml_diff>

<commit_message>
Clarify engineering purpose and evidence of threshold transfer study
</commit_message>
<xml_diff>
--- a/reports/phase2/phase2_threshold_transfer_report.docx
+++ b/reports/phase2/phase2_threshold_transfer_report.docx
@@ -34,7 +34,7 @@
         <w:jc w:val="both"/>
       </w:pPr>
       <w:r>
-        <w:t>Historical capacity feasibility does not ensure that a seismic warning rule retains its workload or decision value on later records. This study separates model fitting, policy selection and testing to evaluate budget-only, cost-only and cost-plus-capacity rules on the UCI Seismic Bumps data. Four subsequent record blocks provide 2,063 test records. XGBoost is the prespecified main model; logistic regression and bagged CART provide robustness checks. At relative missed-shift cost r=10, pooled cost-plus-capacity loss equaled or exceeded the no-alarm reference by 0.00 to 0.82 units per 100 shifts. Despite all reference areas containing positive outcomes, its 40 no-alarm selections comprise 28 unconstrained cost optima and 12 capacity-induced changes. The budget rule exceeded later capacity in 13 of 16 phase–budget settings; cost-plus-capacity exceeded it in 2 of 64 phase–budget–cost settings. These dependent settings use different denominators. Matched-setting comparisons connect reduced capacity excess to changes in detections, missed events and loss. Refitting changes finite-cutoff decisions, while no-alarm rules remain invariant by construction. Paired block intervals and frozen-rule prevalence scenarios characterize decision value and workload under hypothetical costs. Recorded row order is a temporal proxy; the study is retrospective.</w:t>
+        <w:t>Historical capacity feasibility does not ensure that a seismic warning rule retains its workload or decision value on later records. This study separates model fitting, policy selection and testing to evaluate budget-only, cost-only and cost-plus-capacity rules on the UCI Seismic Bumps data. Four subsequent record blocks provide 2,063 test records. XGBoost is the prespecified main model; logistic regression and bagged CART provide robustness checks. At relative missed-shift cost r=10, pooled cost-plus-capacity loss equaled or exceeded the no-alarm reference by 0.00 to 0.82 units per 100 shifts. Despite all reference areas containing positive outcomes, its 40 no-alarm selections comprise 28 unconstrained cost optima and 12 capacity-induced changes. The budget rule exceeded later capacity in 13 of 16 phase–budget settings; cost-plus-capacity exceeded it in 2 of 64 phase–budget–cost settings. These dependent settings use different denominators. Matched-setting comparisons connect reduced capacity excess to changes in detections, missed events and loss. Refitting changes finite-cutoff decisions, while no-alarm rules remain invariant by construction. Paired block intervals and frozen-rule prevalence scenarios characterize decision value and workload under hypothetical costs. The workflow links historical selection audits to later decision value. Recorded row order is a temporal proxy; the study is retrospective.</w:t>
       </w:r>
     </w:p>
     <w:p>
@@ -58,7 +58,7 @@
         <w:jc w:val="both"/>
       </w:pPr>
       <w:r>
-        <w:t>A warning score becomes an inspection decision through a threshold that trades missed hazardous shifts against false alerts. A cutoff selected under historical costs and capacity may trigger a different workload on later records. This study asks whether such rules reduce loss relative to no alarms, how their inspection demand transfers, and how model refitting changes decisions at the same cutoff. An alert identifies a candidate shift for inspection; the labels do not measure inspection effectiveness or avoided accidents.</w:t>
+        <w:t>A warning score becomes an inspection decision through a threshold that trades missed hazardous shifts against false alerts. A cutoff selected under historical costs and capacity may trigger a different workload on later records. This study asks whether such rules reduce loss relative to no alarms, how their inspection demand transfers, and how model refitting changes decisions at the same cutoff. An alert identifies a candidate shift for inspection; the labels do not measure inspection effectiveness or avoided accidents. The contribution is auditable decision analysis that links historical selection reasons to later loss, hazardous-shift coverage and capacity excess, and evaluates refitting at the same numerical cutoff.</w:t>
       </w:r>
     </w:p>
     <w:p>
@@ -11263,7 +11263,7 @@
         <w:jc w:val="both"/>
       </w:pPr>
       <w:r>
-        <w:t>The decision-value comparison explains why lower workload alone is insufficient. At r=10, C can reduce loss relative to A without improving pooled loss relative to no alarms. Its 40 historical no-alarm choices comprise 28 cost optima and 12 capacity-induced changes despite positive reference outcomes. Matched C−A results quantify the accompanying detections, misses and loss. Refitting changes finite-cutoff decisions; invariant no-alarm rules do not establish finite-threshold stability.</w:t>
+        <w:t>Later decision value is assessed jointly through loss, hazardous-shift coverage and workload. At r=10, C can reduce loss relative to A without improving pooled loss relative to no alarms. Its 40 historical no-alarm choices comprise 28 cost optima and 12 capacity-induced changes despite positive reference outcomes. Matched C−A results quantify the accompanying detections, misses and loss. Refitting changes finite-cutoff decisions; invariant no-alarm rules do not establish finite-threshold stability. Together, the selection audit and paired transfer comparisons trace how a historically feasible rule changes its loss and inspection demand on later records.</w:t>
       </w:r>
     </w:p>
     <w:p>

</xml_diff>